<commit_message>
Resume: Sep 2026 update (ballroom TA/touring company, certifications, Maeser)
Adds the BYU Ballroom Dance entry with split TA/touring dates on a
sub-line, reorders skills (Claude API now under Proficient), adds the
CITI certification and Maeser Last Lecture line, and rewrites the
volunteer bullets. Margins and leading tightened to keep one page.

Co-Authored-By: Claude Opus 5 <noreply@anthropic.com>
</commit_message>
<xml_diff>
--- a/Resume/Jordan_Heaton_Resume.docx
+++ b/Resume/Jordan_Heaton_Resume.docx
@@ -4,21 +4,21 @@
   <w:body>
     <w:p>
       <w:pPr>
-        <w:spacing w:line="259" w:lineRule="auto"/>
+        <w:spacing w:after="0" w:line="240" w:lineRule="auto"/>
         <w:jc w:val="center"/>
         <w:rPr>
           <w:b/>
           <w:color w:val="1E3A8A"/>
-          <w:sz w:val="46"/>
+          <w:sz w:val="42"/>
         </w:rPr>
       </w:pPr>
       <w:r>
         <w:rPr>
           <w:b/>
           <w:color w:val="1E3A8A"/>
-          <w:sz w:val="46"/>
+          <w:sz w:val="42"/>
         </w:rPr>
-        <w:t>Jordan Heaton</w:t>
+        <w:t xml:space="preserve">Jordan Heaton</w:t>
       </w:r>
     </w:p>
     <w:p>
@@ -35,70 +35,7 @@
           <w:color w:val="5A5A5A"/>
           <w:sz w:val="19"/>
         </w:rPr>
-        <w:t>(</w:t>
-      </w:r>
-      <w:r>
-        <w:rPr>
-          <w:color w:val="5A5A5A"/>
-          <w:sz w:val="19"/>
-        </w:rPr>
-        <w:t>801</w:t>
-      </w:r>
-      <w:r>
-        <w:rPr>
-          <w:color w:val="5A5A5A"/>
-          <w:sz w:val="19"/>
-        </w:rPr>
-        <w:t>)</w:t>
-      </w:r>
-      <w:r>
-        <w:rPr>
-          <w:color w:val="5A5A5A"/>
-          <w:sz w:val="19"/>
-        </w:rPr>
-        <w:t xml:space="preserve"> 228-0653</w:t>
-      </w:r>
-      <w:r>
-        <w:rPr>
-          <w:color w:val="5A5A5A"/>
-          <w:sz w:val="19"/>
-        </w:rPr>
-        <w:t xml:space="preserve">  ·  jordandheaton@gmail.com  · </w:t>
-      </w:r>
-      <w:r>
-        <w:rPr>
-          <w:color w:val="5A5A5A"/>
-          <w:sz w:val="19"/>
-        </w:rPr>
-        <w:t xml:space="preserve"> </w:t>
-      </w:r>
-      <w:r>
-        <w:rPr>
-          <w:color w:val="5A5A5A"/>
-          <w:sz w:val="19"/>
-        </w:rPr>
-        <w:t>linkedin.com/in/jordan</w:t>
-      </w:r>
-      <w:r>
-        <w:rPr>
-          <w:color w:val="5A5A5A"/>
-          <w:sz w:val="19"/>
-        </w:rPr>
-        <w:t>d</w:t>
-      </w:r>
-      <w:r>
-        <w:rPr>
-          <w:color w:val="5A5A5A"/>
-          <w:sz w:val="19"/>
-        </w:rPr>
-        <w:t>heaton</w:t>
-      </w:r>
-      <w:r>
-        <w:rPr>
-          <w:color w:val="5A5A5A"/>
-          <w:sz w:val="19"/>
-        </w:rPr>
-        <w:t xml:space="preserve">  ·  jordanheaton.com</w:t>
+        <w:t xml:space="preserve">(801) 228-0653  ·  jordandheaton@gmail.com  ·  linkedin.com/in/jordandheaton  ·  jordanheaton.com</w:t>
       </w:r>
     </w:p>
     <w:p>
@@ -113,7 +50,7 @@
     <w:p>
       <w:pPr>
         <w:tabs>
-          <w:tab w:val="right" w:pos="10512"/>
+          <w:tab w:val="right" w:pos="10800"/>
         </w:tabs>
         <w:spacing w:before="40" w:line="259" w:lineRule="auto"/>
         <w:ind w:left="0" w:firstLine="0"/>
@@ -127,7 +64,7 @@
           <w:b/>
           <w:sz w:val="21"/>
         </w:rPr>
-        <w:t>Brigham Young University – Marriott School of Business</w:t>
+        <w:t xml:space="preserve">Brigham Young University, Marriott School of Business</w:t>
       </w:r>
       <w:r>
         <w:rPr>
@@ -135,14 +72,7 @@
           <w:sz w:val="21"/>
         </w:rPr>
         <w:tab/>
-        <w:t xml:space="preserve">Expected Apr </w:t>
-      </w:r>
-      <w:r>
-        <w:rPr>
-          <w:i/>
-          <w:sz w:val="21"/>
-        </w:rPr>
-        <w:t>2029</w:t>
+        <w:t xml:space="preserve">Expected Apr 2029</w:t>
       </w:r>
     </w:p>
     <w:p>
@@ -158,7 +88,7 @@
           <w:i/>
           <w:color w:val="5A5A5A"/>
         </w:rPr>
-        <w:t>Provo, UT   ·   B.S., Information Systems   ·   GPA 4.00   ·   BYU High Honor Roll</w:t>
+        <w:t xml:space="preserve">Provo, UT   ·   B.S., Information Systems (pre-application)   ·   GPA 4.00   ·   BYU High Honor Roll</w:t>
       </w:r>
     </w:p>
     <w:p>
@@ -166,10 +96,7 @@
         <w:spacing w:line="259" w:lineRule="auto"/>
       </w:pPr>
       <w:r>
-        <w:t>Specialized Courses: Spreadsheets &amp; Business Analysis, Financial &amp; Managerial Accounting, Statistics</w:t>
-      </w:r>
-      <w:r>
-        <w:t>.</w:t>
+        <w:t xml:space="preserve">Specialized Courses: Spreadsheets &amp; Business Analysis, Financial &amp; Managerial Accounting, Statistics.</w:t>
       </w:r>
     </w:p>
     <w:p>
@@ -178,7 +105,7 @@
         <w:ind w:left="705"/>
       </w:pPr>
       <w:r>
-        <w:t>Applying to Information Systems program, Fall 2027.</w:t>
+        <w:t xml:space="preserve">Applying to Information Systems program, Fall 2027.</w:t>
       </w:r>
     </w:p>
     <w:p>
@@ -187,10 +114,7 @@
         <w:ind w:left="705"/>
       </w:pPr>
       <w:r>
-        <w:t>Member – Association for Information Systems</w:t>
-      </w:r>
-      <w:r>
-        <w:t>.</w:t>
+        <w:t xml:space="preserve">Member, Association for Information Systems and BYU AI Association.</w:t>
       </w:r>
     </w:p>
     <w:p>
@@ -199,7 +123,7 @@
         <w:ind w:left="705"/>
       </w:pPr>
       <w:r>
-        <w:t>Studied international business practices across France, Italy, and the United Kingdom through BYU's Business Fundamentals in Europe Study Abroad.</w:t>
+        <w:t xml:space="preserve">Studied international business practices in France, Italy, and the United Kingdom through BYU's Business Fundamentals in Europe Study Abroad.</w:t>
       </w:r>
     </w:p>
     <w:p>
@@ -214,7 +138,7 @@
     <w:p>
       <w:pPr>
         <w:tabs>
-          <w:tab w:val="right" w:pos="10512"/>
+          <w:tab w:val="right" w:pos="10800"/>
         </w:tabs>
         <w:spacing w:before="40" w:line="259" w:lineRule="auto"/>
         <w:ind w:left="0" w:firstLine="0"/>
@@ -228,7 +152,7 @@
           <w:b/>
           <w:sz w:val="21"/>
         </w:rPr>
-        <w:t>Research Fellow, BYU Marriott School of Business – Provo, UT</w:t>
+        <w:t xml:space="preserve">Research Fellow, BYU Marriott School of Business – Provo, UT</w:t>
       </w:r>
       <w:r>
         <w:rPr>
@@ -236,7 +160,7 @@
           <w:sz w:val="21"/>
         </w:rPr>
         <w:tab/>
-        <w:t>Sep 2026 – Present</w:t>
+        <w:t xml:space="preserve">Sep 2026 – Present</w:t>
       </w:r>
     </w:p>
     <w:p>
@@ -245,7 +169,7 @@
         <w:ind w:left="705"/>
       </w:pPr>
       <w:r>
-        <w:t>Selected as a research fellow, expected to support faculty publication through database research, data cleaning, and statistical analysis.</w:t>
+        <w:t xml:space="preserve">Selected as a research fellow, expected to support faculty publication through database research, data cleaning, and statistical analysis.</w:t>
       </w:r>
     </w:p>
     <w:p>
@@ -254,13 +178,13 @@
         <w:ind w:left="705"/>
       </w:pPr>
       <w:r>
-        <w:t>Prepare literature reviews and structured datasets for faculty-authored academic papers.</w:t>
+        <w:t xml:space="preserve">Prepare literature reviews and structured datasets for faculty-authored papers.</w:t>
       </w:r>
     </w:p>
     <w:p>
       <w:pPr>
         <w:tabs>
-          <w:tab w:val="right" w:pos="10512"/>
+          <w:tab w:val="right" w:pos="10800"/>
         </w:tabs>
         <w:spacing w:before="40" w:line="259" w:lineRule="auto"/>
         <w:ind w:left="0" w:firstLine="0"/>
@@ -274,15 +198,23 @@
           <w:b/>
           <w:sz w:val="21"/>
         </w:rPr>
-        <w:t>Volunteer Representative, The Church of Jesus Christ of Latter-day Saints – Atlanta, GA</w:t>
-      </w:r>
-      <w:r>
+        <w:t xml:space="preserve">Teaching Assistant and Touring Company Member, BYU Ballroom Dance – Provo, UT</w:t>
+      </w:r>
+    </w:p>
+    <w:p>
+      <w:pPr>
+        <w:spacing w:line="259" w:lineRule="auto"/>
         <w:rPr>
           <w:i/>
-          <w:sz w:val="21"/>
+          <w:color w:val="5A5A5A"/>
         </w:rPr>
-        <w:tab/>
-        <w:t>May 2024 – Feb 2026</w:t>
+      </w:pPr>
+      <w:r>
+        <w:rPr>
+          <w:i/>
+          <w:color w:val="5A5A5A"/>
+        </w:rPr>
+        <w:t xml:space="preserve">Teaching Assistant: Jan 2024 – Apr 2024, Aug 2026 – Present   ·   Touring Company Member: Jun 2026 – Present</w:t>
       </w:r>
     </w:p>
     <w:p>
@@ -291,7 +223,7 @@
         <w:ind w:left="705"/>
       </w:pPr>
       <w:r>
-        <w:t>Led and trained a team of 20+ volunteers across a multi-city region, running weekly planning, assignment, and goal-setting meetings.</w:t>
+        <w:t xml:space="preserve">Instruct 50+ students across two skill levels, adapting technique instruction to mixed-ability partnerships.</w:t>
       </w:r>
     </w:p>
     <w:p>
@@ -300,16 +232,7 @@
         <w:ind w:left="705"/>
       </w:pPr>
       <w:r>
-        <w:t>Train</w:t>
-      </w:r>
-      <w:r>
-        <w:t>ed newly arrived volunteers on outreach methods, daily logistics, and regional operations</w:t>
-      </w:r>
-      <w:r>
-        <w:t>, bringing each to independent fieldwork within their first weeks</w:t>
-      </w:r>
-      <w:r>
-        <w:t>.</w:t>
+        <w:t xml:space="preserve">Compete year-round on formation teams trained since middle school, winning national championships in nearly every season across three annual competitions and multiple touring performances.</w:t>
       </w:r>
     </w:p>
     <w:p>
@@ -318,19 +241,13 @@
         <w:ind w:left="705"/>
       </w:pPr>
       <w:r>
-        <w:t>Expanded community outreach to Atlanta's Spanish-speaking population, working and teaching entirely in Spanish for 2</w:t>
-      </w:r>
-      <w:r>
-        <w:t>2</w:t>
-      </w:r>
-      <w:r>
-        <w:t xml:space="preserve"> months of full-time service.</w:t>
+        <w:t xml:space="preserve">Selected by audition for BYU's Ballroom Dance Touring Company, reigning international formation champion and flagship ensemble of the world's largest collegiate ballroom program.</w:t>
       </w:r>
     </w:p>
     <w:p>
       <w:pPr>
         <w:tabs>
-          <w:tab w:val="right" w:pos="10512"/>
+          <w:tab w:val="right" w:pos="10800"/>
         </w:tabs>
         <w:spacing w:before="40" w:line="259" w:lineRule="auto"/>
         <w:ind w:left="0" w:firstLine="0"/>
@@ -344,21 +261,7 @@
           <w:b/>
           <w:sz w:val="21"/>
         </w:rPr>
-        <w:t>Special Events Staff, B</w:t>
-      </w:r>
-      <w:r>
-        <w:rPr>
-          <w:b/>
-          <w:sz w:val="21"/>
-        </w:rPr>
-        <w:t>YU</w:t>
-      </w:r>
-      <w:r>
-        <w:rPr>
-          <w:b/>
-          <w:sz w:val="21"/>
-        </w:rPr>
-        <w:t xml:space="preserve"> – Provo, UT</w:t>
+        <w:t xml:space="preserve">Volunteer Representative, The Church of Jesus Christ of Latter-day Saints – Atlanta, GA</w:t>
       </w:r>
       <w:r>
         <w:rPr>
@@ -366,7 +269,7 @@
           <w:sz w:val="21"/>
         </w:rPr>
         <w:tab/>
-        <w:t>Sep 2023 – Apr 2024</w:t>
+        <w:t xml:space="preserve">May 2024 – Feb 2026</w:t>
       </w:r>
     </w:p>
     <w:p>
@@ -375,7 +278,7 @@
         <w:ind w:left="705"/>
       </w:pPr>
       <w:r>
-        <w:t>Coordinated ticketing, seating accommodations, and parking logistics for 50+ campus events, including football games and commencement-week venues.</w:t>
+        <w:t xml:space="preserve">Completed 22 months of full-time service working and teaching entirely in Spanish, expanding outreach to Atlanta's Spanish-speaking population.</w:t>
       </w:r>
     </w:p>
     <w:p>
@@ -384,16 +287,62 @@
         <w:ind w:left="705"/>
       </w:pPr>
       <w:r>
-        <w:t>Managed</w:t>
-      </w:r>
-      <w:r>
-        <w:t xml:space="preserve"> guest e</w:t>
-      </w:r>
-      <w:r>
-        <w:t>ntry and policy enforcement at LaVell Edwards Stadium (60,000+ capacity), resolving seating and credential issues at the gate to keep entry lines moving through peak gameday arrivals</w:t>
-      </w:r>
-      <w:r>
-        <w:t>.</w:t>
+        <w:t xml:space="preserve">Set and tracked weekly goals with rotating partners across 5 area assignments, adapting strategy to each community.</w:t>
+      </w:r>
+    </w:p>
+    <w:p>
+      <w:pPr>
+        <w:pStyle w:val="ListBullet"/>
+        <w:ind w:left="705"/>
+      </w:pPr>
+      <w:r>
+        <w:t xml:space="preserve">Taught weekly English classes and performed ongoing community service including cleaning projects and yard work.</w:t>
+      </w:r>
+    </w:p>
+    <w:p>
+      <w:pPr>
+        <w:tabs>
+          <w:tab w:val="right" w:pos="10800"/>
+        </w:tabs>
+        <w:spacing w:before="40" w:line="259" w:lineRule="auto"/>
+        <w:ind w:left="0" w:firstLine="0"/>
+        <w:rPr>
+          <w:b/>
+          <w:sz w:val="21"/>
+        </w:rPr>
+      </w:pPr>
+      <w:r>
+        <w:rPr>
+          <w:b/>
+          <w:sz w:val="21"/>
+        </w:rPr>
+        <w:t xml:space="preserve">Special Events Staff, BYU – Provo, UT</w:t>
+      </w:r>
+      <w:r>
+        <w:rPr>
+          <w:i/>
+          <w:sz w:val="21"/>
+        </w:rPr>
+        <w:tab/>
+        <w:t xml:space="preserve">Sep 2023 – Apr 2024</w:t>
+      </w:r>
+    </w:p>
+    <w:p>
+      <w:pPr>
+        <w:pStyle w:val="ListBullet"/>
+        <w:ind w:left="705"/>
+      </w:pPr>
+      <w:r>
+        <w:t xml:space="preserve">Coordinated ticketing, seating accommodations, and parking logistics for 50+ campus events, including football games and commencement-week venues.</w:t>
+      </w:r>
+    </w:p>
+    <w:p>
+      <w:pPr>
+        <w:pStyle w:val="ListBullet"/>
+        <w:ind w:left="705"/>
+      </w:pPr>
+      <w:r>
+        <w:t xml:space="preserve">Managed guest entry at LaVell Edwards Stadium (60,000+ capacity), resolving seating and credential disputes at the gate to keep lines moving through peak gameday arrivals.</w:t>
       </w:r>
     </w:p>
     <w:p>
@@ -411,16 +360,7 @@
         <w:ind w:left="705"/>
       </w:pPr>
       <w:r>
-        <w:t>Proficient in: Excel (VBA, Solver), HTML, CSS, JavaScript, Git and GitHub, data cleaning, data modeling.</w:t>
-      </w:r>
-    </w:p>
-    <w:p>
-      <w:pPr>
-        <w:pStyle w:val="ListBullet"/>
-        <w:ind w:left="705"/>
-      </w:pPr>
-      <w:r>
-        <w:t>Experienced with: Anthropic Claude API, prompt engineering, optimization modeling, database research, Blender 3D animation.</w:t>
+        <w:t xml:space="preserve">Schedule Optimizer: course-planning tool generating conflict-free schedules under competing constraints (prerequisites, credit load, time preferences, scholarship eligibility across all 10 colleges), built with the Claude API and HTML/CSS/JavaScript.</w:t>
       </w:r>
     </w:p>
     <w:p>
@@ -429,19 +369,7 @@
         <w:ind w:left="1060"/>
       </w:pPr>
       <w:r>
-        <w:t>Schedule Optimizer – course-planning tool that generates conflict-free schedules under competing constraints (prerequisites, credit load, time preferences, scholarship eligibility across all 10 colleges); built with the Claude API and HTML/CSS/JavaScript, cutting multi-hour registration planning to minutes</w:t>
-      </w:r>
-      <w:r>
-        <w:t>.</w:t>
-      </w:r>
-    </w:p>
-    <w:p>
-      <w:pPr>
-        <w:pStyle w:val="ListBullet2"/>
-        <w:ind w:left="1060"/>
-      </w:pPr>
-      <w:r>
-        <w:t>Personal portfolio site built from scratch, plus a browser-based liquid-physics simulation and an arcade game, all deployed with Git and GitHub Pages.</w:t>
+        <w:t xml:space="preserve">Cuts multi-hour registration planning down to minutes; in active development, built independently outside coursework.</w:t>
       </w:r>
     </w:p>
     <w:p>
@@ -450,7 +378,7 @@
         <w:ind w:left="705"/>
       </w:pPr>
       <w:r>
-        <w:t>AWS Certified AI Practitioner – AWS certification covering machine learning and generative AI concepts, prompt engineering, model selection, and responsible AI.</w:t>
+        <w:t xml:space="preserve">Proficient in: Anthropic Claude API, prompt engineering, optimization modeling, database research, Blender 3D animation.</w:t>
       </w:r>
     </w:p>
     <w:p>
@@ -459,7 +387,7 @@
         <w:ind w:left="705"/>
       </w:pPr>
       <w:r>
-        <w:t>National Vice Champion, Ballroom Dancing – trained under international coaches from Poland, Russia, Italy, and Canada; selected by audition for BYU's Ballroom Dance Touring Company, the top ensemble in the largest collegiate ballroom program in the world.</w:t>
+        <w:t xml:space="preserve">Experienced with: Excel (VBA, Solver), HTML, CSS, JavaScript, Git and GitHub, data cleaning, data modeling, SQL.</w:t>
       </w:r>
     </w:p>
     <w:p>
@@ -468,7 +396,7 @@
         <w:ind w:left="705"/>
       </w:pPr>
       <w:r>
-        <w:t>Fluent in Spanish.</w:t>
+        <w:t xml:space="preserve">Built a personal portfolio site from scratch, plus a browser-based liquid-physics simulation and an arcade game, all deployed with Git and GitHub Pages.</w:t>
       </w:r>
     </w:p>
     <w:p>
@@ -477,7 +405,7 @@
         <w:ind w:left="705"/>
       </w:pPr>
       <w:r>
-        <w:t>Member, BYU AI Association – student-run club for applied machine learning and generative AI.</w:t>
+        <w:t xml:space="preserve">Certifications: AWS Certified AI Practitioner (AIF-C01); CITI Program, Social &amp; Behavioral Research Investigators/Mentors.</w:t>
       </w:r>
     </w:p>
     <w:p>
@@ -486,7 +414,7 @@
         <w:ind w:left="705"/>
       </w:pPr>
       <w:r>
-        <w:t>Humanitarian service, Guatemala (Apr 2023) – tracked nutritional health for 50+ children across 4 communities during a two-week project.</w:t>
+        <w:t xml:space="preserve">National Vice Champion, Ballroom Dancing, trained under international coaches from Poland, Russia, Italy, and Canada.</w:t>
       </w:r>
     </w:p>
     <w:p>
@@ -495,16 +423,7 @@
         <w:ind w:left="705"/>
       </w:pPr>
       <w:r>
-        <w:t>Enjoy</w:t>
-      </w:r>
-      <w:r>
-        <w:t xml:space="preserve">: international travel (Egypt, Greece, Israel, France, Italy, England), cross-cultural living (hosted exchange students from China and Spain), skiing, </w:t>
-      </w:r>
-      <w:r>
-        <w:t xml:space="preserve">and </w:t>
-      </w:r>
-      <w:r>
-        <w:t>cooking.</w:t>
+        <w:t xml:space="preserve">Fluent in Spanish.</w:t>
       </w:r>
     </w:p>
     <w:p>
@@ -513,7 +432,34 @@
         <w:ind w:left="705"/>
       </w:pPr>
       <w:r>
-        <w:t>Eagle Scout, Boy Scouts of America – led an environmental restoration project in American Fork Canyon.</w:t>
+        <w:t xml:space="preserve">Karl G. Maeser Preparatory Academy: top-ranked academic high school in Utah; selected by faculty panel as one of ten Last Lecture speakers to address the school before graduation.</w:t>
+      </w:r>
+    </w:p>
+    <w:p>
+      <w:pPr>
+        <w:pStyle w:val="ListBullet"/>
+        <w:ind w:left="705"/>
+      </w:pPr>
+      <w:r>
+        <w:t xml:space="preserve">Humanitarian service, Guatemala (Apr 2023): tracked nutritional health for 50+ children across 4 communities.</w:t>
+      </w:r>
+    </w:p>
+    <w:p>
+      <w:pPr>
+        <w:pStyle w:val="ListBullet"/>
+        <w:ind w:left="705"/>
+      </w:pPr>
+      <w:r>
+        <w:t xml:space="preserve">Enjoy: international travel (Egypt, Greece, Israel, France, Italy, England), cross-cultural living (hosted exchange students from China and Spain), skiing, and cooking.</w:t>
+      </w:r>
+    </w:p>
+    <w:p>
+      <w:pPr>
+        <w:pStyle w:val="ListBullet"/>
+        <w:ind w:left="705"/>
+      </w:pPr>
+      <w:r>
+        <w:t xml:space="preserve">Eagle Scout, Boy Scouts of America, led an environmental restoration project in American Fork Canyon.</w:t>
       </w:r>
     </w:p>
     <w:p>
@@ -533,7 +479,7 @@
       <w:headerReference w:type="first" r:id="rId11"/>
       <w:footerReference w:type="first" r:id="rId12"/>
       <w:pgSz w:w="12240" w:h="15840"/>
-      <w:pgMar w:top="720" w:right="864" w:bottom="720" w:left="864" w:header="720" w:footer="720" w:gutter="0"/>
+      <w:pgMar w:top="560" w:right="720" w:bottom="560" w:left="720" w:header="720" w:footer="720" w:gutter="0"/>
       <w:cols w:space="720"/>
     </w:sectPr>
   </w:body>
@@ -2179,7 +2125,7 @@
     <w:name w:val="Normal"/>
     <w:qFormat/>
     <w:pPr>
-      <w:spacing w:after="14" w:line="248" w:lineRule="auto"/>
+      <w:spacing w:after="14" w:line="232" w:lineRule="auto"/>
     </w:pPr>
     <w:rPr>
       <w:rFonts w:ascii="Calibri" w:eastAsia="Calibri" w:hAnsi="Calibri" w:cs="Calibri"/>
@@ -2196,7 +2142,7 @@
     <w:pPr>
       <w:keepNext/>
       <w:keepLines/>
-      <w:spacing w:before="180" w:after="52" w:line="259" w:lineRule="auto"/>
+      <w:spacing w:before="130" w:after="40" w:line="259" w:lineRule="auto"/>
       <w:outlineLvl w:val="0"/>
     </w:pPr>
     <w:rPr>

</xml_diff>